<commit_message>
PR4: audit fixes (distractor arithmetic, summary giveaways, dv3 figure gap, leading coefficient -1 item, end-quantity speech, named origins), audit md, README row
Co-Authored-By: Claude Opus 5.5 <noreply@anthropic.com>
Claude-Session: https://claude.ai/code/session_013Y8PfETWcMLvmUEpCdE8Wq
</commit_message>
<xml_diff>
--- a/support-materials/PR4/PR4_worked_examples.docx
+++ b/support-materials/PR4/PR4_worked_examples.docx
@@ -789,7 +789,25 @@
         <w:t xml:space="preserve">3</w:t>
       </w:r>
       <w:r>
-        <w:t xml:space="preserve"> terms cancel, as the leading terms always should. Then bring down 45. Adding </w:t>
+        <w:t xml:space="preserve"> terms cancel, as the leading terms always should. Then bring down 45. </w:t>
+      </w:r>
+      <w:r>
+        <w:rPr>
+          <w:i/>
+          <w:iCs/>
+        </w:rPr>
+        <w:t xml:space="preserve">24x</w:t>
+      </w:r>
+      <w:r>
+        <w:rPr>
+          <w:i/>
+          <w:iCs/>
+          <w:vertAlign w:val="superscript"/>
+        </w:rPr>
+        <w:t xml:space="preserve">2</w:t>
+      </w:r>
+      <w:r>
+        <w:t xml:space="preserve"> comes from adding </w:t>
       </w:r>
       <w:r>
         <w:rPr>
@@ -807,7 +825,17 @@
         <w:t xml:space="preserve">2</w:t>
       </w:r>
       <w:r>
-        <w:t xml:space="preserve"> gives </w:t>
+        <w:t xml:space="preserve"> instead of subtracting it, and </w:t>
+      </w:r>
+      <w:r>
+        <w:rPr>
+          <w:i/>
+          <w:iCs/>
+        </w:rPr>
+        <w:t xml:space="preserve">85x</w:t>
+      </w:r>
+      <w:r>
+        <w:t xml:space="preserve"> from adding </w:t>
       </w:r>
       <w:r>
         <w:rPr>
@@ -817,35 +845,7 @@
         <w:t xml:space="preserve">24x</w:t>
       </w:r>
       <w:r>
-        <w:rPr>
-          <w:i/>
-          <w:iCs/>
-          <w:vertAlign w:val="superscript"/>
-        </w:rPr>
-        <w:t xml:space="preserve">2</w:t>
-      </w:r>
-      <w:r>
-        <w:t xml:space="preserve">, and adding </w:t>
-      </w:r>
-      <w:r>
-        <w:rPr>
-          <w:i/>
-          <w:iCs/>
-        </w:rPr>
-        <w:t xml:space="preserve">24x</w:t>
-      </w:r>
-      <w:r>
-        <w:t xml:space="preserve"> gives </w:t>
-      </w:r>
-      <w:r>
-        <w:rPr>
-          <w:i/>
-          <w:iCs/>
-        </w:rPr>
-        <w:t xml:space="preserve">85x</w:t>
-      </w:r>
-      <w:r>
-        <w:t xml:space="preserve">; both happen when only the first term's sign gets changed. Tip: change every sign in the bottom row, then add. </w:t>
+        <w:t xml:space="preserve">. Those happen when only the leading term's sign gets changed; one choice has both slips. Tip: change every sign in the bottom row, then add. </w:t>
       </w:r>
       <w:r>
         <w:rPr>
@@ -1213,7 +1213,7 @@
           <wp:inline distT="0" distB="0" distL="0" distR="0">
             <wp:extent cx="4552950" cy="2476500"/>
             <wp:effectExtent t="0" r="0" b="0" l="0"/>
-            <wp:docPr id="1" name="st4" descr="A long division worked down to a bottom line. Plotted data: A long division. The divisor x squared minus 3x minus 4 is to the left of the bracket, and the dividend is 3x cubed minus 15x squared plus 7x plus 19. Above the bracket is the quotient, 3x minus 6. Below the dividend: subtract 3x cubed minus 9x squared minus 12x, leaving negative 6x squared plus 19x plus 19; then subtract negative 6x squared plus 18x plus 24, leaving x minus 5 on the bottom line." title="A long division worked down to a bottom line"/>
+            <wp:docPr id="1" name="st4" descr="A long division worked down to a bottom line. Plotted data: A long division. The divisor x squared minus 3x minus 4 is to the left of the bracket, and the dividend is 3x cubed minus 15x squared plus 7x plus 19. Above the bracket is the quotient, 3x minus 6. Below the dividend: subtract 3x cubed minus 9x squared minus 12x, leaving negative 6x squared plus 19x plus 19; then subtract the quantity negative 6x squared plus 18x plus 24, leaving x minus 5 on the bottom line." title="A long division worked down to a bottom line"/>
             <wp:cNvGraphicFramePr>
               <a:graphicFrameLocks xmlns:a="http://schemas.openxmlformats.org/drawingml/2006/main" noChangeAspect="1"/>
             </wp:cNvGraphicFramePr>
@@ -1267,7 +1267,7 @@
           <w:sz w:val="22"/>
           <w:szCs w:val="22"/>
         </w:rPr>
-        <w:t xml:space="preserve">A long division. The divisor x squared minus 3x minus 4 is to the left of the bracket, and the dividend is 3x cubed minus 15x squared plus 7x plus 19. Above the bracket is the quotient, 3x minus 6. Below the dividend: subtract 3x cubed minus 9x squared minus 12x, leaving negative 6x squared plus 19x plus 19; then subtract negative 6x squared plus 18x plus 24, leaving x minus 5 on the bottom line.</w:t>
+        <w:t xml:space="preserve">A long division. The divisor x squared minus 3x minus 4 is to the left of the bracket, and the dividend is 3x cubed minus 15x squared plus 7x plus 19. Above the bracket is the quotient, 3x minus 6. Below the dividend: subtract 3x cubed minus 9x squared minus 12x, leaving negative 6x squared plus 19x plus 19; then subtract the quantity negative 6x squared plus 18x plus 24, leaving x minus 5 on the bottom line.</w:t>
       </w:r>
     </w:p>
     <w:p>
@@ -1990,17 +1990,55 @@
         <w:t xml:space="preserve">3x−12</w:t>
       </w:r>
       <w:r>
-        <w:t xml:space="preserve"> loses the sign in </w:t>
-      </w:r>
-      <w:r>
-        <w:rPr>
-          <w:i/>
-          <w:iCs/>
-        </w:rPr>
-        <w:t xml:space="preserve">−6−(−18)</w:t>
-      </w:r>
-      <w:r>
-        <w:t xml:space="preserve">; the remainder </w:t>
+        <w:t xml:space="preserve"> has the wrong sign on 12: </w:t>
+      </w:r>
+      <w:r>
+        <w:rPr>
+          <w:i/>
+          <w:iCs/>
+        </w:rPr>
+        <w:t xml:space="preserve">−6x</w:t>
+      </w:r>
+      <w:r>
+        <w:rPr>
+          <w:i/>
+          <w:iCs/>
+          <w:vertAlign w:val="superscript"/>
+        </w:rPr>
+        <w:t xml:space="preserve">2</w:t>
+      </w:r>
+      <w:r>
+        <w:rPr>
+          <w:i/>
+          <w:iCs/>
+        </w:rPr>
+        <w:t xml:space="preserve">−(−18x</w:t>
+      </w:r>
+      <w:r>
+        <w:rPr>
+          <w:i/>
+          <w:iCs/>
+          <w:vertAlign w:val="superscript"/>
+        </w:rPr>
+        <w:t xml:space="preserve">2</w:t>
+      </w:r>
+      <w:r>
+        <w:rPr>
+          <w:i/>
+          <w:iCs/>
+        </w:rPr>
+        <w:t xml:space="preserve">)=+12x</w:t>
+      </w:r>
+      <w:r>
+        <w:rPr>
+          <w:i/>
+          <w:iCs/>
+          <w:vertAlign w:val="superscript"/>
+        </w:rPr>
+        <w:t xml:space="preserve">2</w:t>
+      </w:r>
+      <w:r>
+        <w:t xml:space="preserve">. The remainder </w:t>
       </w:r>
       <w:r>
         <w:rPr>
@@ -2010,14 +2048,14 @@
         <w:t xml:space="preserve">x−2</w:t>
       </w:r>
       <w:r>
-        <w:t xml:space="preserve"> slips the sign in </w:t>
-      </w:r>
-      <w:r>
-        <w:rPr>
-          <w:i/>
-          <w:iCs/>
-        </w:rPr>
-        <w:t xml:space="preserve">62−60</w:t>
+        <w:t xml:space="preserve"> subtracts in the wrong order, </w:t>
+      </w:r>
+      <w:r>
+        <w:rPr>
+          <w:i/>
+          <w:iCs/>
+        </w:rPr>
+        <w:t xml:space="preserve">60−62</w:t>
       </w:r>
       <w:r>
         <w:t xml:space="preserve">; and the remainder goes over the divisor, not the other way around. </w:t>
@@ -2079,7 +2117,7 @@
           <w:sz w:val="40"/>
           <w:szCs w:val="40"/>
         </w:rPr>
-        <w:t xml:space="preserve">(−3x</w:t>
+        <w:t xml:space="preserve">(−x</w:t>
       </w:r>
       <w:r>
         <w:rPr>
@@ -2098,7 +2136,7 @@
           <w:sz w:val="40"/>
           <w:szCs w:val="40"/>
         </w:rPr>
-        <w:t xml:space="preserve">−12x</w:t>
+        <w:t xml:space="preserve">+3x</w:t>
       </w:r>
       <w:r>
         <w:rPr>
@@ -2117,7 +2155,7 @@
           <w:sz w:val="40"/>
           <w:szCs w:val="40"/>
         </w:rPr>
-        <w:t xml:space="preserve">+34x+89)/(x</w:t>
+        <w:t xml:space="preserve">+11x−19)/(x</w:t>
       </w:r>
       <w:r>
         <w:rPr>
@@ -2136,7 +2174,7 @@
           <w:sz w:val="40"/>
           <w:szCs w:val="40"/>
         </w:rPr>
-        <w:t xml:space="preserve">+7x+10)</w:t>
+        <w:t xml:space="preserve">+x−6)</w:t>
       </w:r>
     </w:p>
     <w:p>
@@ -2173,22 +2211,22 @@
           <w:i/>
           <w:iCs/>
         </w:rPr>
-        <w:t xml:space="preserve">f(x)=−3x+9+(x−1)/(x</w:t>
-      </w:r>
-      <w:r>
-        <w:rPr>
-          <w:i/>
-          <w:iCs/>
-          <w:vertAlign w:val="superscript"/>
-        </w:rPr>
-        <w:t xml:space="preserve">2</w:t>
-      </w:r>
-      <w:r>
-        <w:rPr>
-          <w:i/>
-          <w:iCs/>
-        </w:rPr>
-        <w:t xml:space="preserve">+7x+10)</w:t>
+        <w:t xml:space="preserve">f(x)=−x+4+(x+5)/(x</w:t>
+      </w:r>
+      <w:r>
+        <w:rPr>
+          <w:i/>
+          <w:iCs/>
+          <w:vertAlign w:val="superscript"/>
+        </w:rPr>
+        <w:t xml:space="preserve">2</w:t>
+      </w:r>
+      <w:r>
+        <w:rPr>
+          <w:i/>
+          <w:iCs/>
+        </w:rPr>
+        <w:t xml:space="preserve">+x−6)</w:t>
       </w:r>
     </w:p>
     <w:p>
@@ -2208,22 +2246,22 @@
           <w:i/>
           <w:iCs/>
         </w:rPr>
-        <w:t xml:space="preserve">f(x)=3x+9+(x−1)/(x</w:t>
-      </w:r>
-      <w:r>
-        <w:rPr>
-          <w:i/>
-          <w:iCs/>
-          <w:vertAlign w:val="superscript"/>
-        </w:rPr>
-        <w:t xml:space="preserve">2</w:t>
-      </w:r>
-      <w:r>
-        <w:rPr>
-          <w:i/>
-          <w:iCs/>
-        </w:rPr>
-        <w:t xml:space="preserve">+7x+10)</w:t>
+        <w:t xml:space="preserve">f(x)=x+4+(x+5)/(x</w:t>
+      </w:r>
+      <w:r>
+        <w:rPr>
+          <w:i/>
+          <w:iCs/>
+          <w:vertAlign w:val="superscript"/>
+        </w:rPr>
+        <w:t xml:space="preserve">2</w:t>
+      </w:r>
+      <w:r>
+        <w:rPr>
+          <w:i/>
+          <w:iCs/>
+        </w:rPr>
+        <w:t xml:space="preserve">+x−6)</w:t>
       </w:r>
     </w:p>
     <w:p>
@@ -2243,22 +2281,22 @@
           <w:i/>
           <w:iCs/>
         </w:rPr>
-        <w:t xml:space="preserve">f(x)=−3x−9+(x−1)/(x</w:t>
-      </w:r>
-      <w:r>
-        <w:rPr>
-          <w:i/>
-          <w:iCs/>
-          <w:vertAlign w:val="superscript"/>
-        </w:rPr>
-        <w:t xml:space="preserve">2</w:t>
-      </w:r>
-      <w:r>
-        <w:rPr>
-          <w:i/>
-          <w:iCs/>
-        </w:rPr>
-        <w:t xml:space="preserve">+7x+10)</w:t>
+        <w:t xml:space="preserve">f(x)=−x+2+(x+5)/(x</w:t>
+      </w:r>
+      <w:r>
+        <w:rPr>
+          <w:i/>
+          <w:iCs/>
+          <w:vertAlign w:val="superscript"/>
+        </w:rPr>
+        <w:t xml:space="preserve">2</w:t>
+      </w:r>
+      <w:r>
+        <w:rPr>
+          <w:i/>
+          <w:iCs/>
+        </w:rPr>
+        <w:t xml:space="preserve">+x−6)</w:t>
       </w:r>
     </w:p>
     <w:p>
@@ -2278,7 +2316,7 @@
           <w:i/>
           <w:iCs/>
         </w:rPr>
-        <w:t xml:space="preserve">f(x)=−3x+9+x−1</w:t>
+        <w:t xml:space="preserve">f(x)=−x+4+x+5</w:t>
       </w:r>
     </w:p>
     <w:p>
@@ -2295,11 +2333,24 @@
         <w:spacing w:after="120" w:before="80" w:line="300"/>
       </w:pPr>
       <w:r>
-        <w:rPr>
-          <w:i/>
-          <w:iCs/>
-        </w:rPr>
-        <w:t xml:space="preserve">(−3x</w:t>
+        <w:t xml:space="preserve">The leading coefficient is a hidden </w:t>
+      </w:r>
+      <w:r>
+        <w:rPr>
+          <w:i/>
+          <w:iCs/>
+        </w:rPr>
+        <w:t xml:space="preserve">−1</w:t>
+      </w:r>
+      <w:r>
+        <w:t xml:space="preserve">: </w:t>
+      </w:r>
+      <w:r>
+        <w:rPr>
+          <w:i/>
+          <w:iCs/>
+        </w:rPr>
+        <w:t xml:space="preserve">(−x</w:t>
       </w:r>
       <w:r>
         <w:rPr>
@@ -2329,7 +2380,7 @@
           <w:i/>
           <w:iCs/>
         </w:rPr>
-        <w:t xml:space="preserve">=−3x</w:t>
+        <w:t xml:space="preserve">=−x</w:t>
       </w:r>
       <w:r>
         <w:t xml:space="preserve">. Subtract </w:t>
@@ -2339,22 +2390,22 @@
           <w:i/>
           <w:iCs/>
         </w:rPr>
-        <w:t xml:space="preserve">−3x(x</w:t>
-      </w:r>
-      <w:r>
-        <w:rPr>
-          <w:i/>
-          <w:iCs/>
-          <w:vertAlign w:val="superscript"/>
-        </w:rPr>
-        <w:t xml:space="preserve">2</w:t>
-      </w:r>
-      <w:r>
-        <w:rPr>
-          <w:i/>
-          <w:iCs/>
-        </w:rPr>
-        <w:t xml:space="preserve">+7x+10)=−3x</w:t>
+        <w:t xml:space="preserve">−x(x</w:t>
+      </w:r>
+      <w:r>
+        <w:rPr>
+          <w:i/>
+          <w:iCs/>
+          <w:vertAlign w:val="superscript"/>
+        </w:rPr>
+        <w:t xml:space="preserve">2</w:t>
+      </w:r>
+      <w:r>
+        <w:rPr>
+          <w:i/>
+          <w:iCs/>
+        </w:rPr>
+        <w:t xml:space="preserve">+x−6)=−x</w:t>
       </w:r>
       <w:r>
         <w:rPr>
@@ -2369,22 +2420,22 @@
           <w:i/>
           <w:iCs/>
         </w:rPr>
-        <w:t xml:space="preserve">−21x</w:t>
-      </w:r>
-      <w:r>
-        <w:rPr>
-          <w:i/>
-          <w:iCs/>
-          <w:vertAlign w:val="superscript"/>
-        </w:rPr>
-        <w:t xml:space="preserve">2</w:t>
-      </w:r>
-      <w:r>
-        <w:rPr>
-          <w:i/>
-          <w:iCs/>
-        </w:rPr>
-        <w:t xml:space="preserve">−30x</w:t>
+        <w:t xml:space="preserve">−x</w:t>
+      </w:r>
+      <w:r>
+        <w:rPr>
+          <w:i/>
+          <w:iCs/>
+          <w:vertAlign w:val="superscript"/>
+        </w:rPr>
+        <w:t xml:space="preserve">2</w:t>
+      </w:r>
+      <w:r>
+        <w:rPr>
+          <w:i/>
+          <w:iCs/>
+        </w:rPr>
+        <w:t xml:space="preserve">+6x</w:t>
       </w:r>
       <w:r>
         <w:t xml:space="preserve">: </w:t>
@@ -2394,37 +2445,37 @@
           <w:i/>
           <w:iCs/>
         </w:rPr>
-        <w:t xml:space="preserve">−12x</w:t>
-      </w:r>
-      <w:r>
-        <w:rPr>
-          <w:i/>
-          <w:iCs/>
-          <w:vertAlign w:val="superscript"/>
-        </w:rPr>
-        <w:t xml:space="preserve">2</w:t>
-      </w:r>
-      <w:r>
-        <w:rPr>
-          <w:i/>
-          <w:iCs/>
-        </w:rPr>
-        <w:t xml:space="preserve">+21x</w:t>
-      </w:r>
-      <w:r>
-        <w:rPr>
-          <w:i/>
-          <w:iCs/>
-          <w:vertAlign w:val="superscript"/>
-        </w:rPr>
-        <w:t xml:space="preserve">2</w:t>
-      </w:r>
-      <w:r>
-        <w:rPr>
-          <w:i/>
-          <w:iCs/>
-        </w:rPr>
-        <w:t xml:space="preserve">=9x</w:t>
+        <w:t xml:space="preserve">3x</w:t>
+      </w:r>
+      <w:r>
+        <w:rPr>
+          <w:i/>
+          <w:iCs/>
+          <w:vertAlign w:val="superscript"/>
+        </w:rPr>
+        <w:t xml:space="preserve">2</w:t>
+      </w:r>
+      <w:r>
+        <w:rPr>
+          <w:i/>
+          <w:iCs/>
+        </w:rPr>
+        <w:t xml:space="preserve">−(−x</w:t>
+      </w:r>
+      <w:r>
+        <w:rPr>
+          <w:i/>
+          <w:iCs/>
+          <w:vertAlign w:val="superscript"/>
+        </w:rPr>
+        <w:t xml:space="preserve">2</w:t>
+      </w:r>
+      <w:r>
+        <w:rPr>
+          <w:i/>
+          <w:iCs/>
+        </w:rPr>
+        <w:t xml:space="preserve">)=4x</w:t>
       </w:r>
       <w:r>
         <w:rPr>
@@ -2442,17 +2493,27 @@
           <w:i/>
           <w:iCs/>
         </w:rPr>
-        <w:t xml:space="preserve">34x+30x=64x</w:t>
-      </w:r>
-      <w:r>
-        <w:t xml:space="preserve">; bring down 89. Next, </w:t>
-      </w:r>
-      <w:r>
-        <w:rPr>
-          <w:i/>
-          <w:iCs/>
-        </w:rPr>
-        <w:t xml:space="preserve">(9x</w:t>
+        <w:t xml:space="preserve">11x−6x=5x</w:t>
+      </w:r>
+      <w:r>
+        <w:t xml:space="preserve">; bring down </w:t>
+      </w:r>
+      <w:r>
+        <w:rPr>
+          <w:i/>
+          <w:iCs/>
+        </w:rPr>
+        <w:t xml:space="preserve">−19</w:t>
+      </w:r>
+      <w:r>
+        <w:t xml:space="preserve">. Next, </w:t>
+      </w:r>
+      <w:r>
+        <w:rPr>
+          <w:i/>
+          <w:iCs/>
+        </w:rPr>
+        <w:t xml:space="preserve">(4x</w:t>
       </w:r>
       <w:r>
         <w:rPr>
@@ -2482,7 +2543,7 @@
           <w:i/>
           <w:iCs/>
         </w:rPr>
-        <w:t xml:space="preserve">=9</w:t>
+        <w:t xml:space="preserve">=4</w:t>
       </w:r>
       <w:r>
         <w:t xml:space="preserve">. Subtract </w:t>
@@ -2492,22 +2553,22 @@
           <w:i/>
           <w:iCs/>
         </w:rPr>
-        <w:t xml:space="preserve">9x</w:t>
-      </w:r>
-      <w:r>
-        <w:rPr>
-          <w:i/>
-          <w:iCs/>
-          <w:vertAlign w:val="superscript"/>
-        </w:rPr>
-        <w:t xml:space="preserve">2</w:t>
-      </w:r>
-      <w:r>
-        <w:rPr>
-          <w:i/>
-          <w:iCs/>
-        </w:rPr>
-        <w:t xml:space="preserve">+63x+90</w:t>
+        <w:t xml:space="preserve">4x</w:t>
+      </w:r>
+      <w:r>
+        <w:rPr>
+          <w:i/>
+          <w:iCs/>
+          <w:vertAlign w:val="superscript"/>
+        </w:rPr>
+        <w:t xml:space="preserve">2</w:t>
+      </w:r>
+      <w:r>
+        <w:rPr>
+          <w:i/>
+          <w:iCs/>
+        </w:rPr>
+        <w:t xml:space="preserve">+4x−24</w:t>
       </w:r>
       <w:r>
         <w:t xml:space="preserve">: </w:t>
@@ -2517,7 +2578,7 @@
           <w:i/>
           <w:iCs/>
         </w:rPr>
-        <w:t xml:space="preserve">64x−63x=x</w:t>
+        <w:t xml:space="preserve">5x−4x=x</w:t>
       </w:r>
       <w:r>
         <w:t xml:space="preserve"> and </w:t>
@@ -2527,7 +2588,7 @@
           <w:i/>
           <w:iCs/>
         </w:rPr>
-        <w:t xml:space="preserve">89−90=−1</w:t>
+        <w:t xml:space="preserve">−19−(−24)=5</w:t>
       </w:r>
       <w:r>
         <w:t xml:space="preserve">. The remainder is </w:t>
@@ -2537,58 +2598,98 @@
           <w:i/>
           <w:iCs/>
         </w:rPr>
-        <w:t xml:space="preserve">x−1</w:t>
-      </w:r>
-      <w:r>
-        <w:t xml:space="preserve">. The quotient's first term keeps the negative sign; −9 comes from </w:t>
-      </w:r>
-      <w:r>
-        <w:rPr>
-          <w:i/>
-          <w:iCs/>
-        </w:rPr>
-        <w:t xml:space="preserve">−12−21</w:t>
-      </w:r>
-      <w:r>
-        <w:t xml:space="preserve"> instead of </w:t>
-      </w:r>
-      <w:r>
-        <w:rPr>
-          <w:i/>
-          <w:iCs/>
-        </w:rPr>
-        <w:t xml:space="preserve">−12−(−21)</w:t>
-      </w:r>
-      <w:r>
-        <w:t xml:space="preserve">; and the remainder has to be divided by the divisor, not just added on. </w:t>
-      </w:r>
-      <w:r>
-        <w:rPr>
-          <w:b/>
-          <w:bCs/>
-          <w:i/>
-          <w:iCs/>
-        </w:rPr>
-        <w:t xml:space="preserve">f(x)=−3x+9+(x−1)/(x</w:t>
-      </w:r>
-      <w:r>
-        <w:rPr>
-          <w:b/>
-          <w:bCs/>
-          <w:i/>
-          <w:iCs/>
-          <w:vertAlign w:val="superscript"/>
-        </w:rPr>
-        <w:t xml:space="preserve">2</w:t>
-      </w:r>
-      <w:r>
-        <w:rPr>
-          <w:b/>
-          <w:bCs/>
-          <w:i/>
-          <w:iCs/>
-        </w:rPr>
-        <w:t xml:space="preserve">+7x+10)</w:t>
+        <w:t xml:space="preserve">x+5</w:t>
+      </w:r>
+      <w:r>
+        <w:t xml:space="preserve">. </w:t>
+      </w:r>
+      <w:r>
+        <w:rPr>
+          <w:i/>
+          <w:iCs/>
+        </w:rPr>
+        <w:t xml:space="preserve">x+4</w:t>
+      </w:r>
+      <w:r>
+        <w:t xml:space="preserve"> drops the negative on </w:t>
+      </w:r>
+      <w:r>
+        <w:rPr>
+          <w:i/>
+          <w:iCs/>
+        </w:rPr>
+        <w:t xml:space="preserve">−x</w:t>
+      </w:r>
+      <w:r>
+        <w:t xml:space="preserve">; the 2 comes from </w:t>
+      </w:r>
+      <w:r>
+        <w:rPr>
+          <w:i/>
+          <w:iCs/>
+        </w:rPr>
+        <w:t xml:space="preserve">3x</w:t>
+      </w:r>
+      <w:r>
+        <w:rPr>
+          <w:i/>
+          <w:iCs/>
+          <w:vertAlign w:val="superscript"/>
+        </w:rPr>
+        <w:t xml:space="preserve">2</w:t>
+      </w:r>
+      <w:r>
+        <w:rPr>
+          <w:i/>
+          <w:iCs/>
+        </w:rPr>
+        <w:t xml:space="preserve">+(−x</w:t>
+      </w:r>
+      <w:r>
+        <w:rPr>
+          <w:i/>
+          <w:iCs/>
+          <w:vertAlign w:val="superscript"/>
+        </w:rPr>
+        <w:t xml:space="preserve">2</w:t>
+      </w:r>
+      <w:r>
+        <w:rPr>
+          <w:i/>
+          <w:iCs/>
+        </w:rPr>
+        <w:t xml:space="preserve">)</w:t>
+      </w:r>
+      <w:r>
+        <w:t xml:space="preserve">, adding instead of subtracting; and the remainder has to be divided by the divisor, not just added on. </w:t>
+      </w:r>
+      <w:r>
+        <w:rPr>
+          <w:b/>
+          <w:bCs/>
+          <w:i/>
+          <w:iCs/>
+        </w:rPr>
+        <w:t xml:space="preserve">f(x)=−x+4+(x+5)/(x</w:t>
+      </w:r>
+      <w:r>
+        <w:rPr>
+          <w:b/>
+          <w:bCs/>
+          <w:i/>
+          <w:iCs/>
+          <w:vertAlign w:val="superscript"/>
+        </w:rPr>
+        <w:t xml:space="preserve">2</w:t>
+      </w:r>
+      <w:r>
+        <w:rPr>
+          <w:b/>
+          <w:bCs/>
+          <w:i/>
+          <w:iCs/>
+        </w:rPr>
+        <w:t xml:space="preserve">+x−6)</w:t>
       </w:r>
       <w:r>
         <w:rPr>
@@ -2616,7 +2717,7 @@
           <wp:inline distT="0" distB="0" distL="0" distR="0">
             <wp:extent cx="4762500" cy="1047750"/>
             <wp:effectExtent t="0" r="0" b="0" l="0"/>
-            <wp:docPr id="1" name="dv3" descr="A long division setup with the first quotient term. Plotted data: A long division setup. The divisor x squared plus 3x minus 4 is to the left of the division bracket. Under the bracket is the dividend, written 2x cubed minus 25x plus 26. Above the bracket, the first term of the quotient, 2x, has been written." title="A long division setup with the first quotient term"/>
+            <wp:docPr id="1" name="dv3" descr="A long division setup with the first quotient term. Plotted data: A long division setup. The divisor x squared plus 3x minus 4 is to the left of the division bracket. Under the bracket is the dividend, 2x cubed minus 25x plus 26, with a blank space where an x squared term would go. Above the bracket, the first term of the quotient, 2x, is written above negative 25x." title="A long division setup with the first quotient term"/>
             <wp:cNvGraphicFramePr>
               <a:graphicFrameLocks xmlns:a="http://schemas.openxmlformats.org/drawingml/2006/main" noChangeAspect="1"/>
             </wp:cNvGraphicFramePr>
@@ -2670,7 +2771,7 @@
           <w:sz w:val="22"/>
           <w:szCs w:val="22"/>
         </w:rPr>
-        <w:t xml:space="preserve">A long division setup. The divisor x squared plus 3x minus 4 is to the left of the division bracket. Under the bracket is the dividend, written 2x cubed minus 25x plus 26. Above the bracket, the first term of the quotient, 2x, has been written.</w:t>
+        <w:t xml:space="preserve">A long division setup. The divisor x squared plus 3x minus 4 is to the left of the division bracket. Under the bracket is the dividend, 2x cubed minus 25x plus 26, with a blank space where an x squared term would go. Above the bracket, the first term of the quotient, 2x, is written above negative 25x.</w:t>
       </w:r>
     </w:p>
     <w:p>
@@ -2687,7 +2788,35 @@
         <w:spacing w:after="120" w:before="80" w:line="300"/>
       </w:pPr>
       <w:r>
-        <w:t xml:space="preserve">The dividend has no x² term. Multiply 2x by the divisor and subtract. What is the new line, after bringing down?</w:t>
+        <w:t xml:space="preserve">The dividend has no </w:t>
+      </w:r>
+      <w:r>
+        <w:rPr>
+          <w:i/>
+          <w:iCs/>
+        </w:rPr>
+        <w:t xml:space="preserve">x</w:t>
+      </w:r>
+      <w:r>
+        <w:rPr>
+          <w:i/>
+          <w:iCs/>
+          <w:vertAlign w:val="superscript"/>
+        </w:rPr>
+        <w:t xml:space="preserve">2</w:t>
+      </w:r>
+      <w:r>
+        <w:t xml:space="preserve"> term. Multiply </w:t>
+      </w:r>
+      <w:r>
+        <w:rPr>
+          <w:i/>
+          <w:iCs/>
+        </w:rPr>
+        <w:t xml:space="preserve">2x</w:t>
+      </w:r>
+      <w:r>
+        <w:t xml:space="preserve"> by the divisor and subtract. What is the new line, after bringing down?</w:t>
       </w:r>
     </w:p>
     <w:p>
@@ -3593,24 +3722,82 @@
         <w:t xml:space="preserve">x+1</w:t>
       </w:r>
       <w:r>
-        <w:t xml:space="preserve">, degree 1, the remainder. −12 comes from </w:t>
-      </w:r>
-      <w:r>
-        <w:rPr>
-          <w:i/>
-          <w:iCs/>
-        </w:rPr>
-        <w:t xml:space="preserve">3−9</w:t>
-      </w:r>
-      <w:r>
-        <w:t xml:space="preserve"> instead of </w:t>
-      </w:r>
-      <w:r>
-        <w:rPr>
-          <w:i/>
-          <w:iCs/>
-        </w:rPr>
-        <w:t xml:space="preserve">3−(−9)</w:t>
+        <w:t xml:space="preserve">, degree 1, the remainder. −12 has the right size but the wrong sign: </w:t>
+      </w:r>
+      <w:r>
+        <w:rPr>
+          <w:i/>
+          <w:iCs/>
+        </w:rPr>
+        <w:t xml:space="preserve">3x</w:t>
+      </w:r>
+      <w:r>
+        <w:rPr>
+          <w:i/>
+          <w:iCs/>
+          <w:vertAlign w:val="superscript"/>
+        </w:rPr>
+        <w:t xml:space="preserve">2</w:t>
+      </w:r>
+      <w:r>
+        <w:rPr>
+          <w:i/>
+          <w:iCs/>
+        </w:rPr>
+        <w:t xml:space="preserve">−(−9x</w:t>
+      </w:r>
+      <w:r>
+        <w:rPr>
+          <w:i/>
+          <w:iCs/>
+          <w:vertAlign w:val="superscript"/>
+        </w:rPr>
+        <w:t xml:space="preserve">2</w:t>
+      </w:r>
+      <w:r>
+        <w:rPr>
+          <w:i/>
+          <w:iCs/>
+        </w:rPr>
+        <w:t xml:space="preserve">)=3x</w:t>
+      </w:r>
+      <w:r>
+        <w:rPr>
+          <w:i/>
+          <w:iCs/>
+          <w:vertAlign w:val="superscript"/>
+        </w:rPr>
+        <w:t xml:space="preserve">2</w:t>
+      </w:r>
+      <w:r>
+        <w:rPr>
+          <w:i/>
+          <w:iCs/>
+        </w:rPr>
+        <w:t xml:space="preserve">+9x</w:t>
+      </w:r>
+      <w:r>
+        <w:rPr>
+          <w:i/>
+          <w:iCs/>
+          <w:vertAlign w:val="superscript"/>
+        </w:rPr>
+        <w:t xml:space="preserve">2</w:t>
+      </w:r>
+      <w:r>
+        <w:rPr>
+          <w:i/>
+          <w:iCs/>
+        </w:rPr>
+        <w:t xml:space="preserve">=+12x</w:t>
+      </w:r>
+      <w:r>
+        <w:rPr>
+          <w:i/>
+          <w:iCs/>
+          <w:vertAlign w:val="superscript"/>
+        </w:rPr>
+        <w:t xml:space="preserve">2</w:t>
       </w:r>
       <w:r>
         <w:t xml:space="preserve">; </w:t>
@@ -3806,7 +3993,27 @@
         <w:spacing w:after="120" w:before="80" w:line="300"/>
       </w:pPr>
       <w:r>
-        <w:t xml:space="preserve">Long division gives quotient −2x − 6 and remainder x + 1. How does CheckIt want the answer written?</w:t>
+        <w:t xml:space="preserve">Long division gives quotient </w:t>
+      </w:r>
+      <w:r>
+        <w:rPr>
+          <w:i/>
+          <w:iCs/>
+        </w:rPr>
+        <w:t xml:space="preserve">−2x−6</w:t>
+      </w:r>
+      <w:r>
+        <w:t xml:space="preserve"> and remainder </w:t>
+      </w:r>
+      <w:r>
+        <w:rPr>
+          <w:i/>
+          <w:iCs/>
+        </w:rPr>
+        <w:t xml:space="preserve">x+1</w:t>
+      </w:r>
+      <w:r>
+        <w:t xml:space="preserve">. Which of these equals f(x)?</w:t>
       </w:r>
     </w:p>
     <w:p>
@@ -3846,22 +4053,22 @@
           <w:i/>
           <w:iCs/>
         </w:rPr>
-        <w:t xml:space="preserve">f(x)=−2x−6+(x+1)/(x</w:t>
-      </w:r>
-      <w:r>
-        <w:rPr>
-          <w:i/>
-          <w:iCs/>
-          <w:vertAlign w:val="superscript"/>
-        </w:rPr>
-        <w:t xml:space="preserve">2</w:t>
-      </w:r>
-      <w:r>
-        <w:rPr>
-          <w:i/>
-          <w:iCs/>
-        </w:rPr>
-        <w:t xml:space="preserve">−6x+8)</w:t>
+        <w:t xml:space="preserve">f(x)=−2x−6+(x</w:t>
+      </w:r>
+      <w:r>
+        <w:rPr>
+          <w:i/>
+          <w:iCs/>
+          <w:vertAlign w:val="superscript"/>
+        </w:rPr>
+        <w:t xml:space="preserve">2</w:t>
+      </w:r>
+      <w:r>
+        <w:rPr>
+          <w:i/>
+          <w:iCs/>
+        </w:rPr>
+        <w:t xml:space="preserve">−6x+8)/(x+1)</w:t>
       </w:r>
     </w:p>
     <w:p>
@@ -3881,22 +4088,22 @@
           <w:i/>
           <w:iCs/>
         </w:rPr>
-        <w:t xml:space="preserve">f(x)=−2x−6+(x</w:t>
-      </w:r>
-      <w:r>
-        <w:rPr>
-          <w:i/>
-          <w:iCs/>
-          <w:vertAlign w:val="superscript"/>
-        </w:rPr>
-        <w:t xml:space="preserve">2</w:t>
-      </w:r>
-      <w:r>
-        <w:rPr>
-          <w:i/>
-          <w:iCs/>
-        </w:rPr>
-        <w:t xml:space="preserve">−6x+8)/(x+1)</w:t>
+        <w:t xml:space="preserve">f(x)=−2x−6+(x+1)/(x</w:t>
+      </w:r>
+      <w:r>
+        <w:rPr>
+          <w:i/>
+          <w:iCs/>
+          <w:vertAlign w:val="superscript"/>
+        </w:rPr>
+        <w:t xml:space="preserve">2</w:t>
+      </w:r>
+      <w:r>
+        <w:rPr>
+          <w:i/>
+          <w:iCs/>
+        </w:rPr>
+        <w:t xml:space="preserve">−6x+8)</w:t>
       </w:r>
     </w:p>
     <w:p>
@@ -4078,7 +4285,52 @@
         <w:spacing w:after="120" w:before="80" w:line="300"/>
       </w:pPr>
       <w:r>
-        <w:t xml:space="preserve">Dividing f(x) by x² − 4x − 5 gave quotient −4x + 8 and remainder x + 3. Multiply back as shown. What is f(x)?</w:t>
+        <w:t xml:space="preserve">Dividing f(x) by </w:t>
+      </w:r>
+      <w:r>
+        <w:rPr>
+          <w:i/>
+          <w:iCs/>
+        </w:rPr>
+        <w:t xml:space="preserve">x</w:t>
+      </w:r>
+      <w:r>
+        <w:rPr>
+          <w:i/>
+          <w:iCs/>
+          <w:vertAlign w:val="superscript"/>
+        </w:rPr>
+        <w:t xml:space="preserve">2</w:t>
+      </w:r>
+      <w:r>
+        <w:rPr>
+          <w:i/>
+          <w:iCs/>
+        </w:rPr>
+        <w:t xml:space="preserve">−4x−5</w:t>
+      </w:r>
+      <w:r>
+        <w:t xml:space="preserve"> gave quotient </w:t>
+      </w:r>
+      <w:r>
+        <w:rPr>
+          <w:i/>
+          <w:iCs/>
+        </w:rPr>
+        <w:t xml:space="preserve">−4x+8</w:t>
+      </w:r>
+      <w:r>
+        <w:t xml:space="preserve"> and remainder </w:t>
+      </w:r>
+      <w:r>
+        <w:rPr>
+          <w:i/>
+          <w:iCs/>
+        </w:rPr>
+        <w:t xml:space="preserve">x+3</w:t>
+      </w:r>
+      <w:r>
+        <w:t xml:space="preserve">. Multiply back as shown. What is f(x)?</w:t>
       </w:r>
     </w:p>
     <w:p>
@@ -4128,7 +4380,7 @@
           <w:i/>
           <w:iCs/>
         </w:rPr>
-        <w:t xml:space="preserve">−12x−40</w:t>
+        <w:t xml:space="preserve">−11x−37</w:t>
       </w:r>
     </w:p>
     <w:p>
@@ -4228,7 +4480,7 @@
           <w:i/>
           <w:iCs/>
         </w:rPr>
-        <w:t xml:space="preserve">−11x−37</w:t>
+        <w:t xml:space="preserve">−12x−40</w:t>
       </w:r>
     </w:p>
     <w:p>
@@ -4646,7 +4898,7 @@
         <w:t xml:space="preserve">A.  </w:t>
       </w:r>
       <w:r>
-        <w:t xml:space="preserve">Quotient of degree 1; remainder of degree 1 or less</w:t>
+        <w:t xml:space="preserve">Quotient of degree 1; remainder of degree 2 or less</w:t>
       </w:r>
     </w:p>
     <w:p>
@@ -4662,7 +4914,7 @@
         <w:t xml:space="preserve">B.  </w:t>
       </w:r>
       <w:r>
-        <w:t xml:space="preserve">Quotient of degree 1; remainder of degree 2 or less</w:t>
+        <w:t xml:space="preserve">Quotient of degree 1; remainder of degree 1 or less</w:t>
       </w:r>
     </w:p>
     <w:p>
@@ -4761,7 +5013,7 @@
         <w:t xml:space="preserve">3−2=1</w:t>
       </w:r>
       <w:r>
-        <w:t xml:space="preserve">. The division stops as soon as the bottom line's degree drops below 2, so the remainder has degree 1 or less. A degree 2 remainder would mean you could still divide again. That is the shape of every CheckIt answer: a degree 1 quotient, plus a degree 1 remainder over the divisor. </w:t>
+        <w:t xml:space="preserve">. The division stops as soon as the bottom line's degree drops below 2, so the remainder has degree 1 or less. A degree 2 remainder would mean you could still divide again. That is why the quotient cannot have degree 2 or degree 0. That is the shape of every CheckIt answer: a degree 1 quotient, plus a degree 1 remainder over the divisor. </w:t>
       </w:r>
       <w:r>
         <w:rPr>
@@ -4975,7 +5227,17 @@
         <w:t xml:space="preserve">y=2x−2</w:t>
       </w:r>
       <w:r>
-        <w:t xml:space="preserve">. In calculus this line is called a slant asymptote, and you will find it with limits. </w:t>
+        <w:t xml:space="preserve">. This line is called a slant asymptote. In calculus you will confirm it with limits as </w:t>
+      </w:r>
+      <w:r>
+        <w:rPr>
+          <w:i/>
+          <w:iCs/>
+        </w:rPr>
+        <w:t xml:space="preserve">x</w:t>
+      </w:r>
+      <w:r>
+        <w:t xml:space="preserve"> grows. </w:t>
       </w:r>
       <w:r>
         <w:rPr>
@@ -5040,7 +5302,7 @@
       <w:r>
         <w:drawing>
           <wp:inline distT="0" distB="0" distL="0" distR="0">
-            <wp:extent cx="4762500" cy="1819275"/>
+            <wp:extent cx="4762500" cy="1809750"/>
             <wp:effectExtent t="0" r="0" b="0" l="0"/>
             <wp:docPr id="1" name="sl1" descr="A student's first subtraction in a long division. Plotted data: A student's long division. The divisor x squared minus 2x minus 3 is to the left of the bracket, and the dividend is 4x cubed plus 16x squared minus 59x minus 74. Above the bracket, the first quotient term is 4x. Below the dividend, marked to be subtracted, is 4x cubed minus 8x squared minus 12x, with a line under it. The student's new line below is 24x squared minus 71x minus 74." title="A student's first subtraction in a long division"/>
             <wp:cNvGraphicFramePr>
@@ -5065,7 +5327,7 @@
                   <pic:spPr bwMode="auto">
                     <a:xfrm>
                       <a:off x="0" y="0"/>
-                      <a:ext cx="4762500" cy="1819275"/>
+                      <a:ext cx="4762500" cy="1809750"/>
                     </a:xfrm>
                     <a:prstGeom prst="rect">
                       <a:avLst/>
@@ -5113,7 +5375,72 @@
         <w:spacing w:after="120" w:before="80" w:line="300"/>
       </w:pPr>
       <w:r>
-        <w:t xml:space="preserve">A student is dividing (4x³ + 16x² − 59x − 74) by (x² − 2x − 3). Here is the first subtraction. What is the mistake, if any?</w:t>
+        <w:t xml:space="preserve">A student is dividing </w:t>
+      </w:r>
+      <w:r>
+        <w:rPr>
+          <w:i/>
+          <w:iCs/>
+        </w:rPr>
+        <w:t xml:space="preserve">4x</w:t>
+      </w:r>
+      <w:r>
+        <w:rPr>
+          <w:i/>
+          <w:iCs/>
+          <w:vertAlign w:val="superscript"/>
+        </w:rPr>
+        <w:t xml:space="preserve">3</w:t>
+      </w:r>
+      <w:r>
+        <w:rPr>
+          <w:i/>
+          <w:iCs/>
+        </w:rPr>
+        <w:t xml:space="preserve">+16x</w:t>
+      </w:r>
+      <w:r>
+        <w:rPr>
+          <w:i/>
+          <w:iCs/>
+          <w:vertAlign w:val="superscript"/>
+        </w:rPr>
+        <w:t xml:space="preserve">2</w:t>
+      </w:r>
+      <w:r>
+        <w:rPr>
+          <w:i/>
+          <w:iCs/>
+        </w:rPr>
+        <w:t xml:space="preserve">−59x−74</w:t>
+      </w:r>
+      <w:r>
+        <w:t xml:space="preserve"> by </w:t>
+      </w:r>
+      <w:r>
+        <w:rPr>
+          <w:i/>
+          <w:iCs/>
+        </w:rPr>
+        <w:t xml:space="preserve">x</w:t>
+      </w:r>
+      <w:r>
+        <w:rPr>
+          <w:i/>
+          <w:iCs/>
+          <w:vertAlign w:val="superscript"/>
+        </w:rPr>
+        <w:t xml:space="preserve">2</w:t>
+      </w:r>
+      <w:r>
+        <w:rPr>
+          <w:i/>
+          <w:iCs/>
+        </w:rPr>
+        <w:t xml:space="preserve">−2x−3</w:t>
+      </w:r>
+      <w:r>
+        <w:t xml:space="preserve">. Here is the first subtraction. What is the mistake, if any?</w:t>
       </w:r>
     </w:p>
     <w:p>
@@ -5429,7 +5756,107 @@
         <w:spacing w:after="120" w:before="80" w:line="300"/>
       </w:pPr>
       <w:r>
-        <w:t xml:space="preserve">For (4x³ − 12x² − 63x − 51) ÷ (x² − 5x − 6), a student gave quotient 4x and remainder 8x² − 39x − 51, and wrote this answer. What is the mistake, if any?</w:t>
+        <w:t xml:space="preserve">For </w:t>
+      </w:r>
+      <w:r>
+        <w:rPr>
+          <w:i/>
+          <w:iCs/>
+        </w:rPr>
+        <w:t xml:space="preserve">4x</w:t>
+      </w:r>
+      <w:r>
+        <w:rPr>
+          <w:i/>
+          <w:iCs/>
+          <w:vertAlign w:val="superscript"/>
+        </w:rPr>
+        <w:t xml:space="preserve">3</w:t>
+      </w:r>
+      <w:r>
+        <w:rPr>
+          <w:i/>
+          <w:iCs/>
+        </w:rPr>
+        <w:t xml:space="preserve">−12x</w:t>
+      </w:r>
+      <w:r>
+        <w:rPr>
+          <w:i/>
+          <w:iCs/>
+          <w:vertAlign w:val="superscript"/>
+        </w:rPr>
+        <w:t xml:space="preserve">2</w:t>
+      </w:r>
+      <w:r>
+        <w:rPr>
+          <w:i/>
+          <w:iCs/>
+        </w:rPr>
+        <w:t xml:space="preserve">−63x−51</w:t>
+      </w:r>
+      <w:r>
+        <w:t xml:space="preserve"> divided by </w:t>
+      </w:r>
+      <w:r>
+        <w:rPr>
+          <w:i/>
+          <w:iCs/>
+        </w:rPr>
+        <w:t xml:space="preserve">x</w:t>
+      </w:r>
+      <w:r>
+        <w:rPr>
+          <w:i/>
+          <w:iCs/>
+          <w:vertAlign w:val="superscript"/>
+        </w:rPr>
+        <w:t xml:space="preserve">2</w:t>
+      </w:r>
+      <w:r>
+        <w:rPr>
+          <w:i/>
+          <w:iCs/>
+        </w:rPr>
+        <w:t xml:space="preserve">−5x−6</w:t>
+      </w:r>
+      <w:r>
+        <w:t xml:space="preserve">, a student gave quotient </w:t>
+      </w:r>
+      <w:r>
+        <w:rPr>
+          <w:i/>
+          <w:iCs/>
+        </w:rPr>
+        <w:t xml:space="preserve">4x</w:t>
+      </w:r>
+      <w:r>
+        <w:t xml:space="preserve"> and remainder </w:t>
+      </w:r>
+      <w:r>
+        <w:rPr>
+          <w:i/>
+          <w:iCs/>
+        </w:rPr>
+        <w:t xml:space="preserve">8x</w:t>
+      </w:r>
+      <w:r>
+        <w:rPr>
+          <w:i/>
+          <w:iCs/>
+          <w:vertAlign w:val="superscript"/>
+        </w:rPr>
+        <w:t xml:space="preserve">2</w:t>
+      </w:r>
+      <w:r>
+        <w:rPr>
+          <w:i/>
+          <w:iCs/>
+        </w:rPr>
+        <w:t xml:space="preserve">−39x−51</w:t>
+      </w:r>
+      <w:r>
+        <w:t xml:space="preserve">, and wrote this answer. What is the mistake, if any?</w:t>
       </w:r>
     </w:p>
     <w:p>
@@ -5675,7 +6102,7 @@
         <w:t xml:space="preserve">=4x</w:t>
       </w:r>
       <w:r>
-        <w:t xml:space="preserve">, was right. </w:t>
+        <w:t xml:space="preserve">, was right, and the remainder goes over the divisor, not over the dividend. </w:t>
       </w:r>
       <w:r>
         <w:rPr>
@@ -5910,7 +6337,92 @@
         <w:spacing w:after="120" w:before="80" w:line="300"/>
       </w:pPr>
       <w:r>
-        <w:t xml:space="preserve">For (5x³ − 10x² − 24x + 34) ÷ (x² − 4x + 3), a student got quotient 5x + 10 and remainder x + 4, then checked it this way. What is the mistake, if any?</w:t>
+        <w:t xml:space="preserve">For </w:t>
+      </w:r>
+      <w:r>
+        <w:rPr>
+          <w:i/>
+          <w:iCs/>
+        </w:rPr>
+        <w:t xml:space="preserve">5x</w:t>
+      </w:r>
+      <w:r>
+        <w:rPr>
+          <w:i/>
+          <w:iCs/>
+          <w:vertAlign w:val="superscript"/>
+        </w:rPr>
+        <w:t xml:space="preserve">3</w:t>
+      </w:r>
+      <w:r>
+        <w:rPr>
+          <w:i/>
+          <w:iCs/>
+        </w:rPr>
+        <w:t xml:space="preserve">−10x</w:t>
+      </w:r>
+      <w:r>
+        <w:rPr>
+          <w:i/>
+          <w:iCs/>
+          <w:vertAlign w:val="superscript"/>
+        </w:rPr>
+        <w:t xml:space="preserve">2</w:t>
+      </w:r>
+      <w:r>
+        <w:rPr>
+          <w:i/>
+          <w:iCs/>
+        </w:rPr>
+        <w:t xml:space="preserve">−24x+34</w:t>
+      </w:r>
+      <w:r>
+        <w:t xml:space="preserve"> divided by </w:t>
+      </w:r>
+      <w:r>
+        <w:rPr>
+          <w:i/>
+          <w:iCs/>
+        </w:rPr>
+        <w:t xml:space="preserve">x</w:t>
+      </w:r>
+      <w:r>
+        <w:rPr>
+          <w:i/>
+          <w:iCs/>
+          <w:vertAlign w:val="superscript"/>
+        </w:rPr>
+        <w:t xml:space="preserve">2</w:t>
+      </w:r>
+      <w:r>
+        <w:rPr>
+          <w:i/>
+          <w:iCs/>
+        </w:rPr>
+        <w:t xml:space="preserve">−4x+3</w:t>
+      </w:r>
+      <w:r>
+        <w:t xml:space="preserve">, a student got quotient </w:t>
+      </w:r>
+      <w:r>
+        <w:rPr>
+          <w:i/>
+          <w:iCs/>
+        </w:rPr>
+        <w:t xml:space="preserve">5x+10</w:t>
+      </w:r>
+      <w:r>
+        <w:t xml:space="preserve"> and remainder </w:t>
+      </w:r>
+      <w:r>
+        <w:rPr>
+          <w:i/>
+          <w:iCs/>
+        </w:rPr>
+        <w:t xml:space="preserve">x+4</w:t>
+      </w:r>
+      <w:r>
+        <w:t xml:space="preserve">, then checked it this way. What is the mistake, if any?</w:t>
       </w:r>
     </w:p>
     <w:p>
@@ -6093,7 +6605,17 @@
         <w:t xml:space="preserve">−24x+34</w:t>
       </w:r>
       <w:r>
-        <w:t xml:space="preserve">, the dividend. Also </w:t>
+        <w:t xml:space="preserve">, the dividend. Adding the remainder is the right check, and because the check gives back the dividend, the remainder </w:t>
+      </w:r>
+      <w:r>
+        <w:rPr>
+          <w:i/>
+          <w:iCs/>
+        </w:rPr>
+        <w:t xml:space="preserve">x+4</w:t>
+      </w:r>
+      <w:r>
+        <w:t xml:space="preserve"> is right too. Also </w:t>
       </w:r>
       <w:r>
         <w:rPr>
@@ -6199,7 +6721,92 @@
         <w:spacing w:after="120" w:before="80" w:line="300"/>
       </w:pPr>
       <w:r>
-        <w:t xml:space="preserve">For (−4x³ + 20x² + 33x − 51) ÷ (x² − 4x − 12), a student found quotient −4x + 4 and remainder x − 3, and wrote this answer. What is the mistake, if any?</w:t>
+        <w:t xml:space="preserve">For </w:t>
+      </w:r>
+      <w:r>
+        <w:rPr>
+          <w:i/>
+          <w:iCs/>
+        </w:rPr>
+        <w:t xml:space="preserve">−4x</w:t>
+      </w:r>
+      <w:r>
+        <w:rPr>
+          <w:i/>
+          <w:iCs/>
+          <w:vertAlign w:val="superscript"/>
+        </w:rPr>
+        <w:t xml:space="preserve">3</w:t>
+      </w:r>
+      <w:r>
+        <w:rPr>
+          <w:i/>
+          <w:iCs/>
+        </w:rPr>
+        <w:t xml:space="preserve">+20x</w:t>
+      </w:r>
+      <w:r>
+        <w:rPr>
+          <w:i/>
+          <w:iCs/>
+          <w:vertAlign w:val="superscript"/>
+        </w:rPr>
+        <w:t xml:space="preserve">2</w:t>
+      </w:r>
+      <w:r>
+        <w:rPr>
+          <w:i/>
+          <w:iCs/>
+        </w:rPr>
+        <w:t xml:space="preserve">+33x−51</w:t>
+      </w:r>
+      <w:r>
+        <w:t xml:space="preserve"> divided by </w:t>
+      </w:r>
+      <w:r>
+        <w:rPr>
+          <w:i/>
+          <w:iCs/>
+        </w:rPr>
+        <w:t xml:space="preserve">x</w:t>
+      </w:r>
+      <w:r>
+        <w:rPr>
+          <w:i/>
+          <w:iCs/>
+          <w:vertAlign w:val="superscript"/>
+        </w:rPr>
+        <w:t xml:space="preserve">2</w:t>
+      </w:r>
+      <w:r>
+        <w:rPr>
+          <w:i/>
+          <w:iCs/>
+        </w:rPr>
+        <w:t xml:space="preserve">−4x−12</w:t>
+      </w:r>
+      <w:r>
+        <w:t xml:space="preserve">, a student found quotient </w:t>
+      </w:r>
+      <w:r>
+        <w:rPr>
+          <w:i/>
+          <w:iCs/>
+        </w:rPr>
+        <w:t xml:space="preserve">−4x+4</w:t>
+      </w:r>
+      <w:r>
+        <w:t xml:space="preserve"> and remainder </w:t>
+      </w:r>
+      <w:r>
+        <w:rPr>
+          <w:i/>
+          <w:iCs/>
+        </w:rPr>
+        <w:t xml:space="preserve">x−3</w:t>
+      </w:r>
+      <w:r>
+        <w:t xml:space="preserve">, and wrote this answer. What is the mistake, if any?</w:t>
       </w:r>
     </w:p>
     <w:p>
@@ -6406,7 +7013,7 @@
           <wp:inline distT="0" distB="0" distL="0" distR="0">
             <wp:extent cx="4762500" cy="1819275"/>
             <wp:effectExtent t="0" r="0" b="0" l="0"/>
-            <wp:docPr id="1" name="sl5" descr="A student's first subtraction in a long division. Plotted data: A student's long division. The divisor x squared plus x minus 6 is to the left of the bracket, and the dividend is written 6x cubed minus 41x plus 32. Above the bracket, the student wrote 6x over the second column. Below the dividend, marked to be subtracted, is 6x cubed plus 6x squared minus 36x, written so that 6x squared is under negative 41x and negative 36x is under 32. The student's new line is negative 47x squared plus 68x." title="A student's first subtraction in a long division"/>
+            <wp:docPr id="1" name="sl5" descr="A student's first subtraction in a long division. Plotted data: A student's long division. The divisor x squared plus x minus 6 is to the left of the bracket, and the dividend is written 6x cubed minus 41x plus 32. Above the bracket, the student wrote 6x above negative 41x. Below the dividend, marked to be subtracted, is 6x cubed plus 6x squared minus 36x, written so that 6x squared is under negative 41x and negative 36x is under 32. The student's new line is negative 47x squared plus 68x." title="A student's first subtraction in a long division"/>
             <wp:cNvGraphicFramePr>
               <a:graphicFrameLocks xmlns:a="http://schemas.openxmlformats.org/drawingml/2006/main" noChangeAspect="1"/>
             </wp:cNvGraphicFramePr>
@@ -6460,7 +7067,7 @@
           <w:sz w:val="22"/>
           <w:szCs w:val="22"/>
         </w:rPr>
-        <w:t xml:space="preserve">A student's long division. The divisor x squared plus x minus 6 is to the left of the bracket, and the dividend is written 6x cubed minus 41x plus 32. Above the bracket, the student wrote 6x over the second column. Below the dividend, marked to be subtracted, is 6x cubed plus 6x squared minus 36x, written so that 6x squared is under negative 41x and negative 36x is under 32. The student's new line is negative 47x squared plus 68x.</w:t>
+        <w:t xml:space="preserve">A student's long division. The divisor x squared plus x minus 6 is to the left of the bracket, and the dividend is written 6x cubed minus 41x plus 32. Above the bracket, the student wrote 6x above negative 41x. Below the dividend, marked to be subtracted, is 6x cubed plus 6x squared minus 36x, written so that 6x squared is under negative 41x and negative 36x is under 32. The student's new line is negative 47x squared plus 68x.</w:t>
       </w:r>
     </w:p>
     <w:p>
@@ -6477,7 +7084,57 @@
         <w:spacing w:after="120" w:before="80" w:line="300"/>
       </w:pPr>
       <w:r>
-        <w:t xml:space="preserve">A student is dividing (6x³ − 41x + 32) by (x² + x − 6). Here is the first subtraction. What is the mistake, if any?</w:t>
+        <w:t xml:space="preserve">A student is dividing </w:t>
+      </w:r>
+      <w:r>
+        <w:rPr>
+          <w:i/>
+          <w:iCs/>
+        </w:rPr>
+        <w:t xml:space="preserve">6x</w:t>
+      </w:r>
+      <w:r>
+        <w:rPr>
+          <w:i/>
+          <w:iCs/>
+          <w:vertAlign w:val="superscript"/>
+        </w:rPr>
+        <w:t xml:space="preserve">3</w:t>
+      </w:r>
+      <w:r>
+        <w:rPr>
+          <w:i/>
+          <w:iCs/>
+        </w:rPr>
+        <w:t xml:space="preserve">−41x+32</w:t>
+      </w:r>
+      <w:r>
+        <w:t xml:space="preserve"> by </w:t>
+      </w:r>
+      <w:r>
+        <w:rPr>
+          <w:i/>
+          <w:iCs/>
+        </w:rPr>
+        <w:t xml:space="preserve">x</w:t>
+      </w:r>
+      <w:r>
+        <w:rPr>
+          <w:i/>
+          <w:iCs/>
+          <w:vertAlign w:val="superscript"/>
+        </w:rPr>
+        <w:t xml:space="preserve">2</w:t>
+      </w:r>
+      <w:r>
+        <w:rPr>
+          <w:i/>
+          <w:iCs/>
+        </w:rPr>
+        <w:t xml:space="preserve">+x−6</w:t>
+      </w:r>
+      <w:r>
+        <w:t xml:space="preserve">. Here is the first subtraction. What is the mistake, if any?</w:t>
       </w:r>
     </w:p>
     <w:p>
@@ -6743,7 +7400,47 @@
         <w:t xml:space="preserve">2</w:t>
       </w:r>
       <w:r>
-        <w:t xml:space="preserve"> mixes unlike terms. The product </w:t>
+        <w:t xml:space="preserve"> mixes unlike terms. The quotient term was right, </w:t>
+      </w:r>
+      <w:r>
+        <w:rPr>
+          <w:i/>
+          <w:iCs/>
+        </w:rPr>
+        <w:t xml:space="preserve">6x</w:t>
+      </w:r>
+      <w:r>
+        <w:rPr>
+          <w:i/>
+          <w:iCs/>
+          <w:vertAlign w:val="superscript"/>
+        </w:rPr>
+        <w:t xml:space="preserve">3</w:t>
+      </w:r>
+      <w:r>
+        <w:rPr>
+          <w:i/>
+          <w:iCs/>
+        </w:rPr>
+        <w:t xml:space="preserve">÷ x</w:t>
+      </w:r>
+      <w:r>
+        <w:rPr>
+          <w:i/>
+          <w:iCs/>
+          <w:vertAlign w:val="superscript"/>
+        </w:rPr>
+        <w:t xml:space="preserve">2</w:t>
+      </w:r>
+      <w:r>
+        <w:rPr>
+          <w:i/>
+          <w:iCs/>
+        </w:rPr>
+        <w:t xml:space="preserve">=6x</w:t>
+      </w:r>
+      <w:r>
+        <w:t xml:space="preserve">, and so was the product </w:t>
       </w:r>
       <w:r>
         <w:rPr>
@@ -6798,7 +7495,7 @@
         <w:t xml:space="preserve">−36x</w:t>
       </w:r>
       <w:r>
-        <w:t xml:space="preserve"> was right; the signs change when you subtract, not before. </w:t>
+        <w:t xml:space="preserve">; the signs change when you subtract, not before. </w:t>
       </w:r>
       <w:r>
         <w:rPr>

</xml_diff>